<commit_message>
v2 complete: ACAG processed, FE regression, 4 figures, results section drafted
</commit_message>
<xml_diff>
--- a/outputs/paper/PM25_pediatric_asthma_Philippines_2013-2022.docx
+++ b/outputs/paper/PM25_pediatric_asthma_Philippines_2013-2022.docx
@@ -242,18 +242,1983 @@
       </w:r>
     </w:p>
     <w:p>
-      <w:pPr/>
-      <w:r>
-        <w:rPr>
-          <w:rFonts w:ascii="Times" w:hAnsi="Times" w:cs="Times"/>
-          <w:sz w:val="24"/>
-          <w:sz-cs w:val="24"/>
+      <w:pPr>
+        <w:spacing w:after="321"/>
+      </w:pPr>
+      <w:r>
+        <w:rPr>
+          <w:rFonts w:ascii="Times" w:hAnsi="Times" w:cs="Times"/>
+          <w:sz w:val="48"/>
+          <w:sz-cs w:val="48"/>
+          <w:b/>
+          <w:spacing w:val="0"/>
         </w:rPr>
         <w:t xml:space="preserve">Results</w:t>
       </w:r>
     </w:p>
     <w:p>
       <w:pPr>
+        <w:spacing w:after="240"/>
+      </w:pPr>
+      <w:r>
+        <w:rPr>
+          <w:rFonts w:ascii="Times" w:hAnsi="Times" w:cs="Times"/>
+          <w:sz w:val="24"/>
+          <w:sz-cs w:val="24"/>
+          <w:i/>
+          <w:spacing w:val="0"/>
+        </w:rPr>
+        <w:t xml:space="preserve">PM2.5 Air Pollution and Pediatric Asthma Prevalence in the Philippines (2013–2022): A Subnational Panel Analysis — Hertzan D. Alquizola II</w:t>
+      </w:r>
+      <w:r>
+        <w:rPr>
+          <w:rFonts w:ascii="Times" w:hAnsi="Times" w:cs="Times"/>
+          <w:sz w:val="24"/>
+          <w:sz-cs w:val="24"/>
+          <w:spacing w:val="0"/>
+        </w:rPr>
+        <w:t xml:space="preserve"/>
+      </w:r>
+    </w:p>
+    <w:p>
+      <w:pPr/>
+      <w:r>
+        <w:rPr>
+          <w:rFonts w:ascii="Times" w:hAnsi="Times" w:cs="Times"/>
+          <w:sz w:val="24"/>
+          <w:sz-cs w:val="24"/>
+          <w:spacing w:val="0"/>
+          <w:color w:val="6D6D6D"/>
+        </w:rPr>
+        <w:t xml:space="preserve"/>
+      </w:r>
+    </w:p>
+    <w:p>
+      <w:pPr>
+        <w:spacing w:after="298"/>
+      </w:pPr>
+      <w:r>
+        <w:rPr>
+          <w:rFonts w:ascii="Times" w:hAnsi="Times" w:cs="Times"/>
+          <w:sz w:val="36"/>
+          <w:sz-cs w:val="36"/>
+          <w:b/>
+          <w:spacing w:val="0"/>
+        </w:rPr>
+        <w:t xml:space="preserve">3. Results</w:t>
+      </w:r>
+    </w:p>
+    <w:p>
+      <w:pPr>
+        <w:spacing w:after="280"/>
+      </w:pPr>
+      <w:r>
+        <w:rPr>
+          <w:rFonts w:ascii="Times" w:hAnsi="Times" w:cs="Times"/>
+          <w:sz w:val="28"/>
+          <w:sz-cs w:val="28"/>
+          <w:b/>
+          <w:spacing w:val="0"/>
+        </w:rPr>
+        <w:t xml:space="preserve">3.1 Descriptive Statistics</w:t>
+      </w:r>
+    </w:p>
+    <w:p>
+      <w:pPr>
+        <w:spacing w:after="240"/>
+      </w:pPr>
+      <w:r>
+        <w:rPr>
+          <w:rFonts w:ascii="Times" w:hAnsi="Times" w:cs="Times"/>
+          <w:sz w:val="24"/>
+          <w:sz-cs w:val="24"/>
+          <w:spacing w:val="0"/>
+        </w:rPr>
+        <w:t xml:space="preserve">The merged analytical panel comprised 170 region-year observations across 17 Philippine regions from 2013 to 2022. Annual mean satellite-derived PM2.5 concentrations ranged from 9.65 to 31.59 µg/m³ (mean ± SD: 14.72 ± 3.52 µg/m³), while pediatric asthma prevalence (ages 5–14) ranged from 7,014.45 to 8,908.29 per 100,000 (mean ± SD: 7,477.67 ± 366.89 per 100,000). Descriptive statistics for both variables are presented in Table 1.</w:t>
+      </w:r>
+    </w:p>
+    <w:p>
+      <w:pPr>
+        <w:spacing w:after="240"/>
+      </w:pPr>
+      <w:r>
+        <w:rPr>
+          <w:rFonts w:ascii="Times" w:hAnsi="Times" w:cs="Times"/>
+          <w:sz w:val="24"/>
+          <w:sz-cs w:val="24"/>
+          <w:b/>
+          <w:spacing w:val="0"/>
+        </w:rPr>
+        <w:t xml:space="preserve">Table 1. Descriptive Statistics for Primary Study Variables (n = 170 region-years)</w:t>
+      </w:r>
+      <w:r>
+        <w:rPr>
+          <w:rFonts w:ascii="Times" w:hAnsi="Times" w:cs="Times"/>
+          <w:sz w:val="24"/>
+          <w:sz-cs w:val="24"/>
+          <w:spacing w:val="0"/>
+        </w:rPr>
+        <w:t xml:space="preserve"/>
+      </w:r>
+    </w:p>
+    <w:p>
+      <w:pPr>
+        <w:jc w:val="center"/>
+      </w:pPr>
+      <w:r>
+        <w:rPr>
+          <w:rFonts w:ascii="Times" w:hAnsi="Times" w:cs="Times"/>
+          <w:sz w:val="24"/>
+          <w:sz-cs w:val="24"/>
+          <w:b/>
+          <w:spacing w:val="0"/>
+        </w:rPr>
+        <w:t xml:space="preserve">Variable</w:t>
+      </w:r>
+    </w:p>
+    <w:p>
+      <w:pPr>
+        <w:jc w:val="center"/>
+      </w:pPr>
+      <w:r>
+        <w:rPr>
+          <w:rFonts w:ascii="Times" w:hAnsi="Times" w:cs="Times"/>
+          <w:sz w:val="24"/>
+          <w:sz-cs w:val="24"/>
+          <w:b/>
+          <w:spacing w:val="0"/>
+        </w:rPr>
+        <w:t xml:space="preserve">Mean</w:t>
+      </w:r>
+    </w:p>
+    <w:p>
+      <w:pPr>
+        <w:jc w:val="center"/>
+      </w:pPr>
+      <w:r>
+        <w:rPr>
+          <w:rFonts w:ascii="Times" w:hAnsi="Times" w:cs="Times"/>
+          <w:sz w:val="24"/>
+          <w:sz-cs w:val="24"/>
+          <w:b/>
+          <w:spacing w:val="0"/>
+        </w:rPr>
+        <w:t xml:space="preserve">SD</w:t>
+      </w:r>
+    </w:p>
+    <w:p>
+      <w:pPr>
+        <w:jc w:val="center"/>
+      </w:pPr>
+      <w:r>
+        <w:rPr>
+          <w:rFonts w:ascii="Times" w:hAnsi="Times" w:cs="Times"/>
+          <w:sz w:val="24"/>
+          <w:sz-cs w:val="24"/>
+          <w:b/>
+          <w:spacing w:val="0"/>
+        </w:rPr>
+        <w:t xml:space="preserve">Min</w:t>
+      </w:r>
+    </w:p>
+    <w:p>
+      <w:pPr>
+        <w:jc w:val="center"/>
+      </w:pPr>
+      <w:r>
+        <w:rPr>
+          <w:rFonts w:ascii="Times" w:hAnsi="Times" w:cs="Times"/>
+          <w:sz w:val="24"/>
+          <w:sz-cs w:val="24"/>
+          <w:b/>
+          <w:spacing w:val="0"/>
+        </w:rPr>
+        <w:t xml:space="preserve">25th pct</w:t>
+      </w:r>
+    </w:p>
+    <w:p>
+      <w:pPr>
+        <w:jc w:val="center"/>
+      </w:pPr>
+      <w:r>
+        <w:rPr>
+          <w:rFonts w:ascii="Times" w:hAnsi="Times" w:cs="Times"/>
+          <w:sz w:val="24"/>
+          <w:sz-cs w:val="24"/>
+          <w:b/>
+          <w:spacing w:val="0"/>
+        </w:rPr>
+        <w:t xml:space="preserve">Median</w:t>
+      </w:r>
+    </w:p>
+    <w:p>
+      <w:pPr>
+        <w:jc w:val="center"/>
+      </w:pPr>
+      <w:r>
+        <w:rPr>
+          <w:rFonts w:ascii="Times" w:hAnsi="Times" w:cs="Times"/>
+          <w:sz w:val="24"/>
+          <w:sz-cs w:val="24"/>
+          <w:b/>
+          <w:spacing w:val="0"/>
+        </w:rPr>
+        <w:t xml:space="preserve">75th pct</w:t>
+      </w:r>
+    </w:p>
+    <w:p>
+      <w:pPr>
+        <w:jc w:val="center"/>
+      </w:pPr>
+      <w:r>
+        <w:rPr>
+          <w:rFonts w:ascii="Times" w:hAnsi="Times" w:cs="Times"/>
+          <w:sz w:val="24"/>
+          <w:sz-cs w:val="24"/>
+          <w:b/>
+          <w:spacing w:val="0"/>
+        </w:rPr>
+        <w:t xml:space="preserve">Max</w:t>
+      </w:r>
+    </w:p>
+    <w:p>
+      <w:pPr/>
+      <w:r>
+        <w:rPr>
+          <w:rFonts w:ascii="Times" w:hAnsi="Times" w:cs="Times"/>
+          <w:sz w:val="24"/>
+          <w:sz-cs w:val="24"/>
+          <w:spacing w:val="0"/>
+        </w:rPr>
+        <w:t xml:space="preserve">PM2.5 (µg/m³)</w:t>
+      </w:r>
+    </w:p>
+    <w:p>
+      <w:pPr/>
+      <w:r>
+        <w:rPr>
+          <w:rFonts w:ascii="Times" w:hAnsi="Times" w:cs="Times"/>
+          <w:sz w:val="24"/>
+          <w:sz-cs w:val="24"/>
+          <w:spacing w:val="0"/>
+        </w:rPr>
+        <w:t xml:space="preserve">14.72</w:t>
+      </w:r>
+    </w:p>
+    <w:p>
+      <w:pPr/>
+      <w:r>
+        <w:rPr>
+          <w:rFonts w:ascii="Times" w:hAnsi="Times" w:cs="Times"/>
+          <w:sz w:val="24"/>
+          <w:sz-cs w:val="24"/>
+          <w:spacing w:val="0"/>
+        </w:rPr>
+        <w:t xml:space="preserve">3.52</w:t>
+      </w:r>
+    </w:p>
+    <w:p>
+      <w:pPr/>
+      <w:r>
+        <w:rPr>
+          <w:rFonts w:ascii="Times" w:hAnsi="Times" w:cs="Times"/>
+          <w:sz w:val="24"/>
+          <w:sz-cs w:val="24"/>
+          <w:spacing w:val="0"/>
+        </w:rPr>
+        <w:t xml:space="preserve">9.65</w:t>
+      </w:r>
+    </w:p>
+    <w:p>
+      <w:pPr/>
+      <w:r>
+        <w:rPr>
+          <w:rFonts w:ascii="Times" w:hAnsi="Times" w:cs="Times"/>
+          <w:sz w:val="24"/>
+          <w:sz-cs w:val="24"/>
+          <w:spacing w:val="0"/>
+        </w:rPr>
+        <w:t xml:space="preserve">12.64</w:t>
+      </w:r>
+    </w:p>
+    <w:p>
+      <w:pPr/>
+      <w:r>
+        <w:rPr>
+          <w:rFonts w:ascii="Times" w:hAnsi="Times" w:cs="Times"/>
+          <w:sz w:val="24"/>
+          <w:sz-cs w:val="24"/>
+          <w:spacing w:val="0"/>
+        </w:rPr>
+        <w:t xml:space="preserve">14.33</w:t>
+      </w:r>
+    </w:p>
+    <w:p>
+      <w:pPr/>
+      <w:r>
+        <w:rPr>
+          <w:rFonts w:ascii="Times" w:hAnsi="Times" w:cs="Times"/>
+          <w:sz w:val="24"/>
+          <w:sz-cs w:val="24"/>
+          <w:spacing w:val="0"/>
+        </w:rPr>
+        <w:t xml:space="preserve">15.49</w:t>
+      </w:r>
+    </w:p>
+    <w:p>
+      <w:pPr/>
+      <w:r>
+        <w:rPr>
+          <w:rFonts w:ascii="Times" w:hAnsi="Times" w:cs="Times"/>
+          <w:sz w:val="24"/>
+          <w:sz-cs w:val="24"/>
+          <w:spacing w:val="0"/>
+        </w:rPr>
+        <w:t xml:space="preserve">31.59</w:t>
+      </w:r>
+    </w:p>
+    <w:p>
+      <w:pPr/>
+      <w:r>
+        <w:rPr>
+          <w:rFonts w:ascii="Times" w:hAnsi="Times" w:cs="Times"/>
+          <w:sz w:val="24"/>
+          <w:sz-cs w:val="24"/>
+          <w:spacing w:val="0"/>
+        </w:rPr>
+        <w:t xml:space="preserve">Asthma Prevalence (per 100,000)</w:t>
+      </w:r>
+    </w:p>
+    <w:p>
+      <w:pPr/>
+      <w:r>
+        <w:rPr>
+          <w:rFonts w:ascii="Times" w:hAnsi="Times" w:cs="Times"/>
+          <w:sz w:val="24"/>
+          <w:sz-cs w:val="24"/>
+          <w:spacing w:val="0"/>
+        </w:rPr>
+        <w:t xml:space="preserve">7,477.67</w:t>
+      </w:r>
+    </w:p>
+    <w:p>
+      <w:pPr/>
+      <w:r>
+        <w:rPr>
+          <w:rFonts w:ascii="Times" w:hAnsi="Times" w:cs="Times"/>
+          <w:sz w:val="24"/>
+          <w:sz-cs w:val="24"/>
+          <w:spacing w:val="0"/>
+        </w:rPr>
+        <w:t xml:space="preserve">366.89</w:t>
+      </w:r>
+    </w:p>
+    <w:p>
+      <w:pPr/>
+      <w:r>
+        <w:rPr>
+          <w:rFonts w:ascii="Times" w:hAnsi="Times" w:cs="Times"/>
+          <w:sz w:val="24"/>
+          <w:sz-cs w:val="24"/>
+          <w:spacing w:val="0"/>
+        </w:rPr>
+        <w:t xml:space="preserve">7,014.45</w:t>
+      </w:r>
+    </w:p>
+    <w:p>
+      <w:pPr/>
+      <w:r>
+        <w:rPr>
+          <w:rFonts w:ascii="Times" w:hAnsi="Times" w:cs="Times"/>
+          <w:sz w:val="24"/>
+          <w:sz-cs w:val="24"/>
+          <w:spacing w:val="0"/>
+        </w:rPr>
+        <w:t xml:space="preserve">7,322.33</w:t>
+      </w:r>
+    </w:p>
+    <w:p>
+      <w:pPr/>
+      <w:r>
+        <w:rPr>
+          <w:rFonts w:ascii="Times" w:hAnsi="Times" w:cs="Times"/>
+          <w:sz w:val="24"/>
+          <w:sz-cs w:val="24"/>
+          <w:spacing w:val="0"/>
+        </w:rPr>
+        <w:t xml:space="preserve">7,407.30</w:t>
+      </w:r>
+    </w:p>
+    <w:p>
+      <w:pPr/>
+      <w:r>
+        <w:rPr>
+          <w:rFonts w:ascii="Times" w:hAnsi="Times" w:cs="Times"/>
+          <w:sz w:val="24"/>
+          <w:sz-cs w:val="24"/>
+          <w:spacing w:val="0"/>
+        </w:rPr>
+        <w:t xml:space="preserve">7,505.00</w:t>
+      </w:r>
+    </w:p>
+    <w:p>
+      <w:pPr/>
+      <w:r>
+        <w:rPr>
+          <w:rFonts w:ascii="Times" w:hAnsi="Times" w:cs="Times"/>
+          <w:sz w:val="24"/>
+          <w:sz-cs w:val="24"/>
+          <w:spacing w:val="0"/>
+        </w:rPr>
+        <w:t xml:space="preserve">8,908.29</w:t>
+      </w:r>
+    </w:p>
+    <w:p>
+      <w:pPr>
+        <w:spacing w:after="280"/>
+      </w:pPr>
+      <w:r>
+        <w:rPr>
+          <w:rFonts w:ascii="Times" w:hAnsi="Times" w:cs="Times"/>
+          <w:sz w:val="28"/>
+          <w:sz-cs w:val="28"/>
+          <w:b/>
+          <w:spacing w:val="0"/>
+        </w:rPr>
+        <w:t xml:space="preserve">3.2 WHO Guideline Exceedances</w:t>
+      </w:r>
+    </w:p>
+    <w:p>
+      <w:pPr>
+        <w:spacing w:after="240"/>
+      </w:pPr>
+      <w:r>
+        <w:rPr>
+          <w:rFonts w:ascii="Times" w:hAnsi="Times" w:cs="Times"/>
+          <w:sz w:val="24"/>
+          <w:sz-cs w:val="24"/>
+          <w:spacing w:val="0"/>
+        </w:rPr>
+        <w:t xml:space="preserve">Of the 170 region-year observations, 58 (34.1%) exceeded the WHO annual PM2.5 guideline of 15 µg/m³. The National Capital Region (NCR/Metro Manila) exceeded the WHO threshold in all 10 study years, recording the highest mean PM2.5 of any region (26.74 µg/m³; 1.78× the WHO guideline) and the highest mean pediatric asthma prevalence (8,866 per 100,000). In contrast, Region VIII (Eastern Visayas) recorded the lowest mean PM2.5 (12.06 µg/m³) and the lowest mean asthma prevalence (7,151 per 100,000) of all 17 regions. Regional mean PM2.5 concentrations by region are presented in Figure 3, with bars exceeding the WHO threshold shown in red.</w:t>
+      </w:r>
+    </w:p>
+    <w:p>
+      <w:pPr>
+        <w:spacing w:after="240"/>
+      </w:pPr>
+      <w:r>
+        <w:rPr>
+          <w:rFonts w:ascii="Times" w:hAnsi="Times" w:cs="Times"/>
+          <w:sz w:val="24"/>
+          <w:sz-cs w:val="24"/>
+          <w:b/>
+          <w:spacing w:val="0"/>
+        </w:rPr>
+        <w:t xml:space="preserve">Table 2. Regional Mean PM2.5 and Pediatric Asthma Prevalence, 2013–2022</w:t>
+      </w:r>
+      <w:r>
+        <w:rPr>
+          <w:rFonts w:ascii="Times" w:hAnsi="Times" w:cs="Times"/>
+          <w:sz w:val="24"/>
+          <w:sz-cs w:val="24"/>
+          <w:spacing w:val="0"/>
+        </w:rPr>
+        <w:t xml:space="preserve"/>
+      </w:r>
+    </w:p>
+    <w:p>
+      <w:pPr>
+        <w:jc w:val="center"/>
+      </w:pPr>
+      <w:r>
+        <w:rPr>
+          <w:rFonts w:ascii="Times" w:hAnsi="Times" w:cs="Times"/>
+          <w:sz w:val="24"/>
+          <w:sz-cs w:val="24"/>
+          <w:b/>
+          <w:spacing w:val="0"/>
+        </w:rPr>
+        <w:t xml:space="preserve">Region</w:t>
+      </w:r>
+    </w:p>
+    <w:p>
+      <w:pPr>
+        <w:jc w:val="center"/>
+      </w:pPr>
+      <w:r>
+        <w:rPr>
+          <w:rFonts w:ascii="Times" w:hAnsi="Times" w:cs="Times"/>
+          <w:sz w:val="24"/>
+          <w:sz-cs w:val="24"/>
+          <w:b/>
+          <w:spacing w:val="0"/>
+        </w:rPr>
+        <w:t xml:space="preserve">Mean PM2.5 (µg/m³)</w:t>
+      </w:r>
+    </w:p>
+    <w:p>
+      <w:pPr>
+        <w:jc w:val="center"/>
+      </w:pPr>
+      <w:r>
+        <w:rPr>
+          <w:rFonts w:ascii="Times" w:hAnsi="Times" w:cs="Times"/>
+          <w:sz w:val="24"/>
+          <w:sz-cs w:val="24"/>
+          <w:b/>
+          <w:spacing w:val="0"/>
+        </w:rPr>
+        <w:t xml:space="preserve">Mean Asthma Rate (per 100k)</w:t>
+      </w:r>
+    </w:p>
+    <w:p>
+      <w:pPr>
+        <w:jc w:val="center"/>
+      </w:pPr>
+      <w:r>
+        <w:rPr>
+          <w:rFonts w:ascii="Times" w:hAnsi="Times" w:cs="Times"/>
+          <w:sz w:val="24"/>
+          <w:sz-cs w:val="24"/>
+          <w:b/>
+          <w:spacing w:val="0"/>
+        </w:rPr>
+        <w:t xml:space="preserve">Years Exceeding WHO</w:t>
+      </w:r>
+    </w:p>
+    <w:p>
+      <w:pPr/>
+      <w:r>
+        <w:rPr>
+          <w:rFonts w:ascii="Times" w:hAnsi="Times" w:cs="Times"/>
+          <w:sz w:val="24"/>
+          <w:sz-cs w:val="24"/>
+          <w:spacing w:val="0"/>
+        </w:rPr>
+        <w:t xml:space="preserve">NCR</w:t>
+      </w:r>
+    </w:p>
+    <w:p>
+      <w:pPr/>
+      <w:r>
+        <w:rPr>
+          <w:rFonts w:ascii="Times" w:hAnsi="Times" w:cs="Times"/>
+          <w:sz w:val="24"/>
+          <w:sz-cs w:val="24"/>
+          <w:spacing w:val="0"/>
+        </w:rPr>
+        <w:t xml:space="preserve">26.74</w:t>
+      </w:r>
+    </w:p>
+    <w:p>
+      <w:pPr/>
+      <w:r>
+        <w:rPr>
+          <w:rFonts w:ascii="Times" w:hAnsi="Times" w:cs="Times"/>
+          <w:sz w:val="24"/>
+          <w:sz-cs w:val="24"/>
+          <w:spacing w:val="0"/>
+        </w:rPr>
+        <w:t xml:space="preserve">8,866.13</w:t>
+      </w:r>
+    </w:p>
+    <w:p>
+      <w:pPr/>
+      <w:r>
+        <w:rPr>
+          <w:rFonts w:ascii="Times" w:hAnsi="Times" w:cs="Times"/>
+          <w:sz w:val="24"/>
+          <w:sz-cs w:val="24"/>
+          <w:spacing w:val="0"/>
+        </w:rPr>
+        <w:t xml:space="preserve">10/10</w:t>
+      </w:r>
+    </w:p>
+    <w:p>
+      <w:pPr/>
+      <w:r>
+        <w:rPr>
+          <w:rFonts w:ascii="Times" w:hAnsi="Times" w:cs="Times"/>
+          <w:sz w:val="24"/>
+          <w:sz-cs w:val="24"/>
+          <w:spacing w:val="0"/>
+        </w:rPr>
+        <w:t xml:space="preserve">Region I</w:t>
+      </w:r>
+    </w:p>
+    <w:p>
+      <w:pPr/>
+      <w:r>
+        <w:rPr>
+          <w:rFonts w:ascii="Times" w:hAnsi="Times" w:cs="Times"/>
+          <w:sz w:val="24"/>
+          <w:sz-cs w:val="24"/>
+          <w:spacing w:val="0"/>
+        </w:rPr>
+        <w:t xml:space="preserve">15.65</w:t>
+      </w:r>
+    </w:p>
+    <w:p>
+      <w:pPr/>
+      <w:r>
+        <w:rPr>
+          <w:rFonts w:ascii="Times" w:hAnsi="Times" w:cs="Times"/>
+          <w:sz w:val="24"/>
+          <w:sz-cs w:val="24"/>
+          <w:spacing w:val="0"/>
+        </w:rPr>
+        <w:t xml:space="preserve">7,545.65</w:t>
+      </w:r>
+    </w:p>
+    <w:p>
+      <w:pPr/>
+      <w:r>
+        <w:rPr>
+          <w:rFonts w:ascii="Times" w:hAnsi="Times" w:cs="Times"/>
+          <w:sz w:val="24"/>
+          <w:sz-cs w:val="24"/>
+          <w:spacing w:val="0"/>
+        </w:rPr>
+        <w:t xml:space="preserve">7/10</w:t>
+      </w:r>
+    </w:p>
+    <w:p>
+      <w:pPr/>
+      <w:r>
+        <w:rPr>
+          <w:rFonts w:ascii="Times" w:hAnsi="Times" w:cs="Times"/>
+          <w:sz w:val="24"/>
+          <w:sz-cs w:val="24"/>
+          <w:spacing w:val="0"/>
+        </w:rPr>
+        <w:t xml:space="preserve">Region III</w:t>
+      </w:r>
+    </w:p>
+    <w:p>
+      <w:pPr/>
+      <w:r>
+        <w:rPr>
+          <w:rFonts w:ascii="Times" w:hAnsi="Times" w:cs="Times"/>
+          <w:sz w:val="24"/>
+          <w:sz-cs w:val="24"/>
+          <w:spacing w:val="0"/>
+        </w:rPr>
+        <w:t xml:space="preserve">15.48</w:t>
+      </w:r>
+    </w:p>
+    <w:p>
+      <w:pPr/>
+      <w:r>
+        <w:rPr>
+          <w:rFonts w:ascii="Times" w:hAnsi="Times" w:cs="Times"/>
+          <w:sz w:val="24"/>
+          <w:sz-cs w:val="24"/>
+          <w:spacing w:val="0"/>
+        </w:rPr>
+        <w:t xml:space="preserve">7,516.81</w:t>
+      </w:r>
+    </w:p>
+    <w:p>
+      <w:pPr/>
+      <w:r>
+        <w:rPr>
+          <w:rFonts w:ascii="Times" w:hAnsi="Times" w:cs="Times"/>
+          <w:sz w:val="24"/>
+          <w:sz-cs w:val="24"/>
+          <w:spacing w:val="0"/>
+        </w:rPr>
+        <w:t xml:space="preserve">7/10</w:t>
+      </w:r>
+    </w:p>
+    <w:p>
+      <w:pPr/>
+      <w:r>
+        <w:rPr>
+          <w:rFonts w:ascii="Times" w:hAnsi="Times" w:cs="Times"/>
+          <w:sz w:val="24"/>
+          <w:sz-cs w:val="24"/>
+          <w:spacing w:val="0"/>
+        </w:rPr>
+        <w:t xml:space="preserve">Region VII</w:t>
+      </w:r>
+    </w:p>
+    <w:p>
+      <w:pPr/>
+      <w:r>
+        <w:rPr>
+          <w:rFonts w:ascii="Times" w:hAnsi="Times" w:cs="Times"/>
+          <w:sz w:val="24"/>
+          <w:sz-cs w:val="24"/>
+          <w:spacing w:val="0"/>
+        </w:rPr>
+        <w:t xml:space="preserve">15.26</w:t>
+      </w:r>
+    </w:p>
+    <w:p>
+      <w:pPr/>
+      <w:r>
+        <w:rPr>
+          <w:rFonts w:ascii="Times" w:hAnsi="Times" w:cs="Times"/>
+          <w:sz w:val="24"/>
+          <w:sz-cs w:val="24"/>
+          <w:spacing w:val="0"/>
+        </w:rPr>
+        <w:t xml:space="preserve">7,390.96</w:t>
+      </w:r>
+    </w:p>
+    <w:p>
+      <w:pPr/>
+      <w:r>
+        <w:rPr>
+          <w:rFonts w:ascii="Times" w:hAnsi="Times" w:cs="Times"/>
+          <w:sz w:val="24"/>
+          <w:sz-cs w:val="24"/>
+          <w:spacing w:val="0"/>
+        </w:rPr>
+        <w:t xml:space="preserve">6/10</w:t>
+      </w:r>
+    </w:p>
+    <w:p>
+      <w:pPr/>
+      <w:r>
+        <w:rPr>
+          <w:rFonts w:ascii="Times" w:hAnsi="Times" w:cs="Times"/>
+          <w:sz w:val="24"/>
+          <w:sz-cs w:val="24"/>
+          <w:spacing w:val="0"/>
+        </w:rPr>
+        <w:t xml:space="preserve">Region IV-A</w:t>
+      </w:r>
+    </w:p>
+    <w:p>
+      <w:pPr/>
+      <w:r>
+        <w:rPr>
+          <w:rFonts w:ascii="Times" w:hAnsi="Times" w:cs="Times"/>
+          <w:sz w:val="24"/>
+          <w:sz-cs w:val="24"/>
+          <w:spacing w:val="0"/>
+        </w:rPr>
+        <w:t xml:space="preserve">15.25</w:t>
+      </w:r>
+    </w:p>
+    <w:p>
+      <w:pPr/>
+      <w:r>
+        <w:rPr>
+          <w:rFonts w:ascii="Times" w:hAnsi="Times" w:cs="Times"/>
+          <w:sz w:val="24"/>
+          <w:sz-cs w:val="24"/>
+          <w:spacing w:val="0"/>
+        </w:rPr>
+        <w:t xml:space="preserve">7,570.85</w:t>
+      </w:r>
+    </w:p>
+    <w:p>
+      <w:pPr/>
+      <w:r>
+        <w:rPr>
+          <w:rFonts w:ascii="Times" w:hAnsi="Times" w:cs="Times"/>
+          <w:sz w:val="24"/>
+          <w:sz-cs w:val="24"/>
+          <w:spacing w:val="0"/>
+        </w:rPr>
+        <w:t xml:space="preserve">5/10</w:t>
+      </w:r>
+    </w:p>
+    <w:p>
+      <w:pPr/>
+      <w:r>
+        <w:rPr>
+          <w:rFonts w:ascii="Times" w:hAnsi="Times" w:cs="Times"/>
+          <w:sz w:val="24"/>
+          <w:sz-cs w:val="24"/>
+          <w:spacing w:val="0"/>
+        </w:rPr>
+        <w:t xml:space="preserve">Region VI</w:t>
+      </w:r>
+    </w:p>
+    <w:p>
+      <w:pPr/>
+      <w:r>
+        <w:rPr>
+          <w:rFonts w:ascii="Times" w:hAnsi="Times" w:cs="Times"/>
+          <w:sz w:val="24"/>
+          <w:sz-cs w:val="24"/>
+          <w:spacing w:val="0"/>
+        </w:rPr>
+        <w:t xml:space="preserve">14.96</w:t>
+      </w:r>
+    </w:p>
+    <w:p>
+      <w:pPr/>
+      <w:r>
+        <w:rPr>
+          <w:rFonts w:ascii="Times" w:hAnsi="Times" w:cs="Times"/>
+          <w:sz w:val="24"/>
+          <w:sz-cs w:val="24"/>
+          <w:spacing w:val="0"/>
+        </w:rPr>
+        <w:t xml:space="preserve">7,473.95</w:t>
+      </w:r>
+    </w:p>
+    <w:p>
+      <w:pPr/>
+      <w:r>
+        <w:rPr>
+          <w:rFonts w:ascii="Times" w:hAnsi="Times" w:cs="Times"/>
+          <w:sz w:val="24"/>
+          <w:sz-cs w:val="24"/>
+          <w:spacing w:val="0"/>
+        </w:rPr>
+        <w:t xml:space="preserve">5/10</w:t>
+      </w:r>
+    </w:p>
+    <w:p>
+      <w:pPr/>
+      <w:r>
+        <w:rPr>
+          <w:rFonts w:ascii="Times" w:hAnsi="Times" w:cs="Times"/>
+          <w:sz w:val="24"/>
+          <w:sz-cs w:val="24"/>
+          <w:spacing w:val="0"/>
+        </w:rPr>
+        <w:t xml:space="preserve">Region XII</w:t>
+      </w:r>
+    </w:p>
+    <w:p>
+      <w:pPr/>
+      <w:r>
+        <w:rPr>
+          <w:rFonts w:ascii="Times" w:hAnsi="Times" w:cs="Times"/>
+          <w:sz w:val="24"/>
+          <w:sz-cs w:val="24"/>
+          <w:spacing w:val="0"/>
+        </w:rPr>
+        <w:t xml:space="preserve">14.83</w:t>
+      </w:r>
+    </w:p>
+    <w:p>
+      <w:pPr/>
+      <w:r>
+        <w:rPr>
+          <w:rFonts w:ascii="Times" w:hAnsi="Times" w:cs="Times"/>
+          <w:sz w:val="24"/>
+          <w:sz-cs w:val="24"/>
+          <w:spacing w:val="0"/>
+        </w:rPr>
+        <w:t xml:space="preserve">7,410.08</w:t>
+      </w:r>
+    </w:p>
+    <w:p>
+      <w:pPr/>
+      <w:r>
+        <w:rPr>
+          <w:rFonts w:ascii="Times" w:hAnsi="Times" w:cs="Times"/>
+          <w:sz w:val="24"/>
+          <w:sz-cs w:val="24"/>
+          <w:spacing w:val="0"/>
+        </w:rPr>
+        <w:t xml:space="preserve">3/10</w:t>
+      </w:r>
+    </w:p>
+    <w:p>
+      <w:pPr/>
+      <w:r>
+        <w:rPr>
+          <w:rFonts w:ascii="Times" w:hAnsi="Times" w:cs="Times"/>
+          <w:sz w:val="24"/>
+          <w:sz-cs w:val="24"/>
+          <w:spacing w:val="0"/>
+        </w:rPr>
+        <w:t xml:space="preserve">BARMM</w:t>
+      </w:r>
+    </w:p>
+    <w:p>
+      <w:pPr/>
+      <w:r>
+        <w:rPr>
+          <w:rFonts w:ascii="Times" w:hAnsi="Times" w:cs="Times"/>
+          <w:sz w:val="24"/>
+          <w:sz-cs w:val="24"/>
+          <w:spacing w:val="0"/>
+        </w:rPr>
+        <w:t xml:space="preserve">14.50</w:t>
+      </w:r>
+    </w:p>
+    <w:p>
+      <w:pPr/>
+      <w:r>
+        <w:rPr>
+          <w:rFonts w:ascii="Times" w:hAnsi="Times" w:cs="Times"/>
+          <w:sz w:val="24"/>
+          <w:sz-cs w:val="24"/>
+          <w:spacing w:val="0"/>
+        </w:rPr>
+        <w:t xml:space="preserve">7,309.85</w:t>
+      </w:r>
+    </w:p>
+    <w:p>
+      <w:pPr/>
+      <w:r>
+        <w:rPr>
+          <w:rFonts w:ascii="Times" w:hAnsi="Times" w:cs="Times"/>
+          <w:sz w:val="24"/>
+          <w:sz-cs w:val="24"/>
+          <w:spacing w:val="0"/>
+        </w:rPr>
+        <w:t xml:space="preserve">4/10</w:t>
+      </w:r>
+    </w:p>
+    <w:p>
+      <w:pPr/>
+      <w:r>
+        <w:rPr>
+          <w:rFonts w:ascii="Times" w:hAnsi="Times" w:cs="Times"/>
+          <w:sz w:val="24"/>
+          <w:sz-cs w:val="24"/>
+          <w:spacing w:val="0"/>
+        </w:rPr>
+        <w:t xml:space="preserve">Region X</w:t>
+      </w:r>
+    </w:p>
+    <w:p>
+      <w:pPr/>
+      <w:r>
+        <w:rPr>
+          <w:rFonts w:ascii="Times" w:hAnsi="Times" w:cs="Times"/>
+          <w:sz w:val="24"/>
+          <w:sz-cs w:val="24"/>
+          <w:spacing w:val="0"/>
+        </w:rPr>
+        <w:t xml:space="preserve">14.32</w:t>
+      </w:r>
+    </w:p>
+    <w:p>
+      <w:pPr/>
+      <w:r>
+        <w:rPr>
+          <w:rFonts w:ascii="Times" w:hAnsi="Times" w:cs="Times"/>
+          <w:sz w:val="24"/>
+          <w:sz-cs w:val="24"/>
+          <w:spacing w:val="0"/>
+        </w:rPr>
+        <w:t xml:space="preserve">7,399.06</w:t>
+      </w:r>
+    </w:p>
+    <w:p>
+      <w:pPr/>
+      <w:r>
+        <w:rPr>
+          <w:rFonts w:ascii="Times" w:hAnsi="Times" w:cs="Times"/>
+          <w:sz w:val="24"/>
+          <w:sz-cs w:val="24"/>
+          <w:spacing w:val="0"/>
+        </w:rPr>
+        <w:t xml:space="preserve">3/10</w:t>
+      </w:r>
+    </w:p>
+    <w:p>
+      <w:pPr/>
+      <w:r>
+        <w:rPr>
+          <w:rFonts w:ascii="Times" w:hAnsi="Times" w:cs="Times"/>
+          <w:sz w:val="24"/>
+          <w:sz-cs w:val="24"/>
+          <w:spacing w:val="0"/>
+        </w:rPr>
+        <w:t xml:space="preserve">Region XI</w:t>
+      </w:r>
+    </w:p>
+    <w:p>
+      <w:pPr/>
+      <w:r>
+        <w:rPr>
+          <w:rFonts w:ascii="Times" w:hAnsi="Times" w:cs="Times"/>
+          <w:sz w:val="24"/>
+          <w:sz-cs w:val="24"/>
+          <w:spacing w:val="0"/>
+        </w:rPr>
+        <w:t xml:space="preserve">14.12</w:t>
+      </w:r>
+    </w:p>
+    <w:p>
+      <w:pPr/>
+      <w:r>
+        <w:rPr>
+          <w:rFonts w:ascii="Times" w:hAnsi="Times" w:cs="Times"/>
+          <w:sz w:val="24"/>
+          <w:sz-cs w:val="24"/>
+          <w:spacing w:val="0"/>
+        </w:rPr>
+        <w:t xml:space="preserve">7,325.31</w:t>
+      </w:r>
+    </w:p>
+    <w:p>
+      <w:pPr/>
+      <w:r>
+        <w:rPr>
+          <w:rFonts w:ascii="Times" w:hAnsi="Times" w:cs="Times"/>
+          <w:sz w:val="24"/>
+          <w:sz-cs w:val="24"/>
+          <w:spacing w:val="0"/>
+        </w:rPr>
+        <w:t xml:space="preserve">4/10</w:t>
+      </w:r>
+    </w:p>
+    <w:p>
+      <w:pPr/>
+      <w:r>
+        <w:rPr>
+          <w:rFonts w:ascii="Times" w:hAnsi="Times" w:cs="Times"/>
+          <w:sz w:val="24"/>
+          <w:sz-cs w:val="24"/>
+          <w:spacing w:val="0"/>
+        </w:rPr>
+        <w:t xml:space="preserve">CAR</w:t>
+      </w:r>
+    </w:p>
+    <w:p>
+      <w:pPr/>
+      <w:r>
+        <w:rPr>
+          <w:rFonts w:ascii="Times" w:hAnsi="Times" w:cs="Times"/>
+          <w:sz w:val="24"/>
+          <w:sz-cs w:val="24"/>
+          <w:spacing w:val="0"/>
+        </w:rPr>
+        <w:t xml:space="preserve">14.00</w:t>
+      </w:r>
+    </w:p>
+    <w:p>
+      <w:pPr/>
+      <w:r>
+        <w:rPr>
+          <w:rFonts w:ascii="Times" w:hAnsi="Times" w:cs="Times"/>
+          <w:sz w:val="24"/>
+          <w:sz-cs w:val="24"/>
+          <w:spacing w:val="0"/>
+        </w:rPr>
+        <w:t xml:space="preserve">7,485.85</w:t>
+      </w:r>
+    </w:p>
+    <w:p>
+      <w:pPr/>
+      <w:r>
+        <w:rPr>
+          <w:rFonts w:ascii="Times" w:hAnsi="Times" w:cs="Times"/>
+          <w:sz w:val="24"/>
+          <w:sz-cs w:val="24"/>
+          <w:spacing w:val="0"/>
+        </w:rPr>
+        <w:t xml:space="preserve">1/10</w:t>
+      </w:r>
+    </w:p>
+    <w:p>
+      <w:pPr/>
+      <w:r>
+        <w:rPr>
+          <w:rFonts w:ascii="Times" w:hAnsi="Times" w:cs="Times"/>
+          <w:sz w:val="24"/>
+          <w:sz-cs w:val="24"/>
+          <w:spacing w:val="0"/>
+        </w:rPr>
+        <w:t xml:space="preserve">Region IX</w:t>
+      </w:r>
+    </w:p>
+    <w:p>
+      <w:pPr/>
+      <w:r>
+        <w:rPr>
+          <w:rFonts w:ascii="Times" w:hAnsi="Times" w:cs="Times"/>
+          <w:sz w:val="24"/>
+          <w:sz-cs w:val="24"/>
+          <w:spacing w:val="0"/>
+        </w:rPr>
+        <w:t xml:space="preserve">13.38</w:t>
+      </w:r>
+    </w:p>
+    <w:p>
+      <w:pPr/>
+      <w:r>
+        <w:rPr>
+          <w:rFonts w:ascii="Times" w:hAnsi="Times" w:cs="Times"/>
+          <w:sz w:val="24"/>
+          <w:sz-cs w:val="24"/>
+          <w:spacing w:val="0"/>
+        </w:rPr>
+        <w:t xml:space="preserve">7,380.92</w:t>
+      </w:r>
+    </w:p>
+    <w:p>
+      <w:pPr/>
+      <w:r>
+        <w:rPr>
+          <w:rFonts w:ascii="Times" w:hAnsi="Times" w:cs="Times"/>
+          <w:sz w:val="24"/>
+          <w:sz-cs w:val="24"/>
+          <w:spacing w:val="0"/>
+        </w:rPr>
+        <w:t xml:space="preserve">2/10</w:t>
+      </w:r>
+    </w:p>
+    <w:p>
+      <w:pPr/>
+      <w:r>
+        <w:rPr>
+          <w:rFonts w:ascii="Times" w:hAnsi="Times" w:cs="Times"/>
+          <w:sz w:val="24"/>
+          <w:sz-cs w:val="24"/>
+          <w:spacing w:val="0"/>
+        </w:rPr>
+        <w:t xml:space="preserve">Region XIII</w:t>
+      </w:r>
+    </w:p>
+    <w:p>
+      <w:pPr/>
+      <w:r>
+        <w:rPr>
+          <w:rFonts w:ascii="Times" w:hAnsi="Times" w:cs="Times"/>
+          <w:sz w:val="24"/>
+          <w:sz-cs w:val="24"/>
+          <w:spacing w:val="0"/>
+        </w:rPr>
+        <w:t xml:space="preserve">12.97</w:t>
+      </w:r>
+    </w:p>
+    <w:p>
+      <w:pPr/>
+      <w:r>
+        <w:rPr>
+          <w:rFonts w:ascii="Times" w:hAnsi="Times" w:cs="Times"/>
+          <w:sz w:val="24"/>
+          <w:sz-cs w:val="24"/>
+          <w:spacing w:val="0"/>
+        </w:rPr>
+        <w:t xml:space="preserve">7,250.30</w:t>
+      </w:r>
+    </w:p>
+    <w:p>
+      <w:pPr/>
+      <w:r>
+        <w:rPr>
+          <w:rFonts w:ascii="Times" w:hAnsi="Times" w:cs="Times"/>
+          <w:sz w:val="24"/>
+          <w:sz-cs w:val="24"/>
+          <w:spacing w:val="0"/>
+        </w:rPr>
+        <w:t xml:space="preserve">1/10</w:t>
+      </w:r>
+    </w:p>
+    <w:p>
+      <w:pPr/>
+      <w:r>
+        <w:rPr>
+          <w:rFonts w:ascii="Times" w:hAnsi="Times" w:cs="Times"/>
+          <w:sz w:val="24"/>
+          <w:sz-cs w:val="24"/>
+          <w:spacing w:val="0"/>
+        </w:rPr>
+        <w:t xml:space="preserve">Region II</w:t>
+      </w:r>
+    </w:p>
+    <w:p>
+      <w:pPr/>
+      <w:r>
+        <w:rPr>
+          <w:rFonts w:ascii="Times" w:hAnsi="Times" w:cs="Times"/>
+          <w:sz w:val="24"/>
+          <w:sz-cs w:val="24"/>
+          <w:spacing w:val="0"/>
+        </w:rPr>
+        <w:t xml:space="preserve">12.47</w:t>
+      </w:r>
+    </w:p>
+    <w:p>
+      <w:pPr/>
+      <w:r>
+        <w:rPr>
+          <w:rFonts w:ascii="Times" w:hAnsi="Times" w:cs="Times"/>
+          <w:sz w:val="24"/>
+          <w:sz-cs w:val="24"/>
+          <w:spacing w:val="0"/>
+        </w:rPr>
+        <w:t xml:space="preserve">7,432.01</w:t>
+      </w:r>
+    </w:p>
+    <w:p>
+      <w:pPr/>
+      <w:r>
+        <w:rPr>
+          <w:rFonts w:ascii="Times" w:hAnsi="Times" w:cs="Times"/>
+          <w:sz w:val="24"/>
+          <w:sz-cs w:val="24"/>
+          <w:spacing w:val="0"/>
+        </w:rPr>
+        <w:t xml:space="preserve">0/10</w:t>
+      </w:r>
+    </w:p>
+    <w:p>
+      <w:pPr/>
+      <w:r>
+        <w:rPr>
+          <w:rFonts w:ascii="Times" w:hAnsi="Times" w:cs="Times"/>
+          <w:sz w:val="24"/>
+          <w:sz-cs w:val="24"/>
+          <w:spacing w:val="0"/>
+        </w:rPr>
+        <w:t xml:space="preserve">Region IV-B</w:t>
+      </w:r>
+    </w:p>
+    <w:p>
+      <w:pPr/>
+      <w:r>
+        <w:rPr>
+          <w:rFonts w:ascii="Times" w:hAnsi="Times" w:cs="Times"/>
+          <w:sz w:val="24"/>
+          <w:sz-cs w:val="24"/>
+          <w:spacing w:val="0"/>
+        </w:rPr>
+        <w:t xml:space="preserve">12.18</w:t>
+      </w:r>
+    </w:p>
+    <w:p>
+      <w:pPr/>
+      <w:r>
+        <w:rPr>
+          <w:rFonts w:ascii="Times" w:hAnsi="Times" w:cs="Times"/>
+          <w:sz w:val="24"/>
+          <w:sz-cs w:val="24"/>
+          <w:spacing w:val="0"/>
+        </w:rPr>
+        <w:t xml:space="preserve">7,316.57</w:t>
+      </w:r>
+    </w:p>
+    <w:p>
+      <w:pPr/>
+      <w:r>
+        <w:rPr>
+          <w:rFonts w:ascii="Times" w:hAnsi="Times" w:cs="Times"/>
+          <w:sz w:val="24"/>
+          <w:sz-cs w:val="24"/>
+          <w:spacing w:val="0"/>
+        </w:rPr>
+        <w:t xml:space="preserve">0/10</w:t>
+      </w:r>
+    </w:p>
+    <w:p>
+      <w:pPr/>
+      <w:r>
+        <w:rPr>
+          <w:rFonts w:ascii="Times" w:hAnsi="Times" w:cs="Times"/>
+          <w:sz w:val="24"/>
+          <w:sz-cs w:val="24"/>
+          <w:spacing w:val="0"/>
+        </w:rPr>
+        <w:t xml:space="preserve">Region V</w:t>
+      </w:r>
+    </w:p>
+    <w:p>
+      <w:pPr/>
+      <w:r>
+        <w:rPr>
+          <w:rFonts w:ascii="Times" w:hAnsi="Times" w:cs="Times"/>
+          <w:sz w:val="24"/>
+          <w:sz-cs w:val="24"/>
+          <w:spacing w:val="0"/>
+        </w:rPr>
+        <w:t xml:space="preserve">12.12</w:t>
+      </w:r>
+    </w:p>
+    <w:p>
+      <w:pPr/>
+      <w:r>
+        <w:rPr>
+          <w:rFonts w:ascii="Times" w:hAnsi="Times" w:cs="Times"/>
+          <w:sz w:val="24"/>
+          <w:sz-cs w:val="24"/>
+          <w:spacing w:val="0"/>
+        </w:rPr>
+        <w:t xml:space="preserve">7,294.60</w:t>
+      </w:r>
+    </w:p>
+    <w:p>
+      <w:pPr/>
+      <w:r>
+        <w:rPr>
+          <w:rFonts w:ascii="Times" w:hAnsi="Times" w:cs="Times"/>
+          <w:sz w:val="24"/>
+          <w:sz-cs w:val="24"/>
+          <w:spacing w:val="0"/>
+        </w:rPr>
+        <w:t xml:space="preserve">0/10</w:t>
+      </w:r>
+    </w:p>
+    <w:p>
+      <w:pPr/>
+      <w:r>
+        <w:rPr>
+          <w:rFonts w:ascii="Times" w:hAnsi="Times" w:cs="Times"/>
+          <w:sz w:val="24"/>
+          <w:sz-cs w:val="24"/>
+          <w:spacing w:val="0"/>
+        </w:rPr>
+        <w:t xml:space="preserve">Region VIII</w:t>
+      </w:r>
+    </w:p>
+    <w:p>
+      <w:pPr/>
+      <w:r>
+        <w:rPr>
+          <w:rFonts w:ascii="Times" w:hAnsi="Times" w:cs="Times"/>
+          <w:sz w:val="24"/>
+          <w:sz-cs w:val="24"/>
+          <w:spacing w:val="0"/>
+        </w:rPr>
+        <w:t xml:space="preserve">12.06</w:t>
+      </w:r>
+    </w:p>
+    <w:p>
+      <w:pPr/>
+      <w:r>
+        <w:rPr>
+          <w:rFonts w:ascii="Times" w:hAnsi="Times" w:cs="Times"/>
+          <w:sz w:val="24"/>
+          <w:sz-cs w:val="24"/>
+          <w:spacing w:val="0"/>
+        </w:rPr>
+        <w:t xml:space="preserve">7,151.41</w:t>
+      </w:r>
+    </w:p>
+    <w:p>
+      <w:pPr/>
+      <w:r>
+        <w:rPr>
+          <w:rFonts w:ascii="Times" w:hAnsi="Times" w:cs="Times"/>
+          <w:sz w:val="24"/>
+          <w:sz-cs w:val="24"/>
+          <w:spacing w:val="0"/>
+        </w:rPr>
+        <w:t xml:space="preserve">0/10</w:t>
+      </w:r>
+    </w:p>
+    <w:p>
+      <w:pPr>
+        <w:spacing w:after="280"/>
+      </w:pPr>
+      <w:r>
+        <w:rPr>
+          <w:rFonts w:ascii="Times" w:hAnsi="Times" w:cs="Times"/>
+          <w:sz w:val="28"/>
+          <w:sz-cs w:val="28"/>
+          <w:b/>
+          <w:spacing w:val="0"/>
+        </w:rPr>
+        <w:t xml:space="preserve">3.3 Unadjusted Correlations</w:t>
+      </w:r>
+    </w:p>
+    <w:p>
+      <w:pPr>
+        <w:spacing w:after="240"/>
+      </w:pPr>
+      <w:r>
+        <w:rPr>
+          <w:rFonts w:ascii="Times" w:hAnsi="Times" w:cs="Times"/>
+          <w:sz w:val="24"/>
+          <w:sz-cs w:val="24"/>
+          <w:spacing w:val="0"/>
+        </w:rPr>
+        <w:t xml:space="preserve">In pooled cross-sectional analysis, PM2.5 concentration was strongly and positively associated with pediatric asthma prevalence (Pearson r = 0.887, p &lt; 0.0001; Spearman ρ = 0.583, p &lt; 0.0001), as shown in Figure 1. The magnitude of the Pearson correlation reflects a pronounced cross-regional gradient in which more urbanized, higher-pollution regions — particularly NCR — also exhibited substantially higher asthma prevalence. However, as detailed below, this cross-sectional association is likely confounded by regional differences in urbanization, healthcare access, and diagnostic capacity, which are addressed in the fixed-effects specification.</w:t>
+      </w:r>
+    </w:p>
+    <w:p>
+      <w:pPr>
+        <w:spacing w:after="280"/>
+      </w:pPr>
+      <w:r>
+        <w:rPr>
+          <w:rFonts w:ascii="Times" w:hAnsi="Times" w:cs="Times"/>
+          <w:sz w:val="28"/>
+          <w:sz-cs w:val="28"/>
+          <w:b/>
+          <w:spacing w:val="0"/>
+        </w:rPr>
+        <w:t xml:space="preserve">3.4 Two-Way Fixed-Effects Panel Regression</w:t>
+      </w:r>
+    </w:p>
+    <w:p>
+      <w:pPr>
+        <w:spacing w:after="240"/>
+      </w:pPr>
+      <w:r>
+        <w:rPr>
+          <w:rFonts w:ascii="Times" w:hAnsi="Times" w:cs="Times"/>
+          <w:sz w:val="24"/>
+          <w:sz-cs w:val="24"/>
+          <w:spacing w:val="0"/>
+        </w:rPr>
+        <w:t xml:space="preserve">To isolate the within-region, over-time relationship between PM2.5 and pediatric asthma prevalence — and to remove confounding from time-invariant regional characteristics and shared national trends — we estimated two-way fixed-effects panel models with region and year effects and standard errors clustered by region.</w:t>
+      </w:r>
+    </w:p>
+    <w:p>
+      <w:pPr>
+        <w:spacing w:after="240"/>
+      </w:pPr>
+      <w:r>
+        <w:rPr>
+          <w:rFonts w:ascii="Times" w:hAnsi="Times" w:cs="Times"/>
+          <w:sz w:val="24"/>
+          <w:sz-cs w:val="24"/>
+          <w:spacing w:val="0"/>
+        </w:rPr>
+        <w:t xml:space="preserve">In the levels specification (Model A), a 1 µg/m³ increase in annual mean PM2.5 within a region was associated with a statistically significant decrease of 2.554 per 100,000 in pediatric asthma prevalence (β = −2.554, SE = 0.825, p = 0.0024; within-R² = 0.080). The log-log specification (Model B) yielded a similar directional result, with a 1% increase in PM2.5 associated with a 0.005% decrease in asthma prevalence (β = −0.005, SE = 0.002, p = 0.0078; within-R² = 0.052).</w:t>
+      </w:r>
+    </w:p>
+    <w:p>
+      <w:pPr>
+        <w:spacing w:after="240"/>
+      </w:pPr>
+      <w:r>
+        <w:rPr>
+          <w:rFonts w:ascii="Times" w:hAnsi="Times" w:cs="Times"/>
+          <w:sz w:val="24"/>
+          <w:sz-cs w:val="24"/>
+          <w:b/>
+          <w:spacing w:val="0"/>
+        </w:rPr>
+        <w:t xml:space="preserve">Table 3. Two-Way Fixed-Effects Panel Regression Results</w:t>
+      </w:r>
+      <w:r>
+        <w:rPr>
+          <w:rFonts w:ascii="Times" w:hAnsi="Times" w:cs="Times"/>
+          <w:sz w:val="24"/>
+          <w:sz-cs w:val="24"/>
+          <w:spacing w:val="0"/>
+        </w:rPr>
+        <w:t xml:space="preserve"/>
+      </w:r>
+    </w:p>
+    <w:p>
+      <w:pPr>
+        <w:jc w:val="center"/>
+      </w:pPr>
+      <w:r>
+        <w:rPr>
+          <w:rFonts w:ascii="Times" w:hAnsi="Times" w:cs="Times"/>
+          <w:sz w:val="24"/>
+          <w:sz-cs w:val="24"/>
+          <w:b/>
+          <w:spacing w:val="0"/>
+        </w:rPr>
+        <w:t xml:space="preserve">Model</w:t>
+      </w:r>
+    </w:p>
+    <w:p>
+      <w:pPr>
+        <w:jc w:val="center"/>
+      </w:pPr>
+      <w:r>
+        <w:rPr>
+          <w:rFonts w:ascii="Times" w:hAnsi="Times" w:cs="Times"/>
+          <w:sz w:val="24"/>
+          <w:sz-cs w:val="24"/>
+          <w:b/>
+          <w:spacing w:val="0"/>
+        </w:rPr>
+        <w:t xml:space="preserve">Specification</w:t>
+      </w:r>
+    </w:p>
+    <w:p>
+      <w:pPr>
+        <w:jc w:val="center"/>
+      </w:pPr>
+      <w:r>
+        <w:rPr>
+          <w:rFonts w:ascii="Times" w:hAnsi="Times" w:cs="Times"/>
+          <w:sz w:val="24"/>
+          <w:sz-cs w:val="24"/>
+          <w:b/>
+          <w:spacing w:val="0"/>
+        </w:rPr>
+        <w:t xml:space="preserve">β</w:t>
+      </w:r>
+    </w:p>
+    <w:p>
+      <w:pPr>
+        <w:jc w:val="center"/>
+      </w:pPr>
+      <w:r>
+        <w:rPr>
+          <w:rFonts w:ascii="Times" w:hAnsi="Times" w:cs="Times"/>
+          <w:sz w:val="24"/>
+          <w:sz-cs w:val="24"/>
+          <w:b/>
+          <w:spacing w:val="0"/>
+        </w:rPr>
+        <w:t xml:space="preserve">SE</w:t>
+      </w:r>
+    </w:p>
+    <w:p>
+      <w:pPr>
+        <w:jc w:val="center"/>
+      </w:pPr>
+      <w:r>
+        <w:rPr>
+          <w:rFonts w:ascii="Times" w:hAnsi="Times" w:cs="Times"/>
+          <w:sz w:val="24"/>
+          <w:sz-cs w:val="24"/>
+          <w:b/>
+          <w:spacing w:val="0"/>
+        </w:rPr>
+        <w:t xml:space="preserve">p-value</w:t>
+      </w:r>
+    </w:p>
+    <w:p>
+      <w:pPr>
+        <w:jc w:val="center"/>
+      </w:pPr>
+      <w:r>
+        <w:rPr>
+          <w:rFonts w:ascii="Times" w:hAnsi="Times" w:cs="Times"/>
+          <w:sz w:val="24"/>
+          <w:sz-cs w:val="24"/>
+          <w:b/>
+          <w:spacing w:val="0"/>
+        </w:rPr>
+        <w:t xml:space="preserve">Within-R²</w:t>
+      </w:r>
+    </w:p>
+    <w:p>
+      <w:pPr/>
+      <w:r>
+        <w:rPr>
+          <w:rFonts w:ascii="Times" w:hAnsi="Times" w:cs="Times"/>
+          <w:sz w:val="24"/>
+          <w:sz-cs w:val="24"/>
+          <w:spacing w:val="0"/>
+        </w:rPr>
+        <w:t xml:space="preserve">A</w:t>
+      </w:r>
+    </w:p>
+    <w:p>
+      <w:pPr/>
+      <w:r>
+        <w:rPr>
+          <w:rFonts w:ascii="Times" w:hAnsi="Times" w:cs="Times"/>
+          <w:sz w:val="24"/>
+          <w:sz-cs w:val="24"/>
+          <w:spacing w:val="0"/>
+        </w:rPr>
+        <w:t xml:space="preserve">Levels: asthma ~ PM2.5 + region FE + year FE</w:t>
+      </w:r>
+    </w:p>
+    <w:p>
+      <w:pPr/>
+      <w:r>
+        <w:rPr>
+          <w:rFonts w:ascii="Times" w:hAnsi="Times" w:cs="Times"/>
+          <w:sz w:val="24"/>
+          <w:sz-cs w:val="24"/>
+          <w:spacing w:val="0"/>
+        </w:rPr>
+        <w:t xml:space="preserve">−2.554</w:t>
+      </w:r>
+    </w:p>
+    <w:p>
+      <w:pPr/>
+      <w:r>
+        <w:rPr>
+          <w:rFonts w:ascii="Times" w:hAnsi="Times" w:cs="Times"/>
+          <w:sz w:val="24"/>
+          <w:sz-cs w:val="24"/>
+          <w:spacing w:val="0"/>
+        </w:rPr>
+        <w:t xml:space="preserve">0.825</w:t>
+      </w:r>
+    </w:p>
+    <w:p>
+      <w:pPr/>
+      <w:r>
+        <w:rPr>
+          <w:rFonts w:ascii="Times" w:hAnsi="Times" w:cs="Times"/>
+          <w:sz w:val="24"/>
+          <w:sz-cs w:val="24"/>
+          <w:spacing w:val="0"/>
+        </w:rPr>
+        <w:t xml:space="preserve">0.0024</w:t>
+      </w:r>
+    </w:p>
+    <w:p>
+      <w:pPr/>
+      <w:r>
+        <w:rPr>
+          <w:rFonts w:ascii="Times" w:hAnsi="Times" w:cs="Times"/>
+          <w:sz w:val="24"/>
+          <w:sz-cs w:val="24"/>
+          <w:spacing w:val="0"/>
+        </w:rPr>
+        <w:t xml:space="preserve">0.080</w:t>
+      </w:r>
+    </w:p>
+    <w:p>
+      <w:pPr/>
+      <w:r>
+        <w:rPr>
+          <w:rFonts w:ascii="Times" w:hAnsi="Times" w:cs="Times"/>
+          <w:sz w:val="24"/>
+          <w:sz-cs w:val="24"/>
+          <w:spacing w:val="0"/>
+        </w:rPr>
+        <w:t xml:space="preserve">B</w:t>
+      </w:r>
+    </w:p>
+    <w:p>
+      <w:pPr/>
+      <w:r>
+        <w:rPr>
+          <w:rFonts w:ascii="Times" w:hAnsi="Times" w:cs="Times"/>
+          <w:sz w:val="24"/>
+          <w:sz-cs w:val="24"/>
+          <w:spacing w:val="0"/>
+        </w:rPr>
+        <w:t xml:space="preserve">Log-log: ln(asthma) ~ ln(PM2.5) + region FE + year FE</w:t>
+      </w:r>
+    </w:p>
+    <w:p>
+      <w:pPr/>
+      <w:r>
+        <w:rPr>
+          <w:rFonts w:ascii="Times" w:hAnsi="Times" w:cs="Times"/>
+          <w:sz w:val="24"/>
+          <w:sz-cs w:val="24"/>
+          <w:spacing w:val="0"/>
+        </w:rPr>
+        <w:t xml:space="preserve">−0.005</w:t>
+      </w:r>
+    </w:p>
+    <w:p>
+      <w:pPr/>
+      <w:r>
+        <w:rPr>
+          <w:rFonts w:ascii="Times" w:hAnsi="Times" w:cs="Times"/>
+          <w:sz w:val="24"/>
+          <w:sz-cs w:val="24"/>
+          <w:spacing w:val="0"/>
+        </w:rPr>
+        <w:t xml:space="preserve">0.002</w:t>
+      </w:r>
+    </w:p>
+    <w:p>
+      <w:pPr/>
+      <w:r>
+        <w:rPr>
+          <w:rFonts w:ascii="Times" w:hAnsi="Times" w:cs="Times"/>
+          <w:sz w:val="24"/>
+          <w:sz-cs w:val="24"/>
+          <w:spacing w:val="0"/>
+        </w:rPr>
+        <w:t xml:space="preserve">0.0078</w:t>
+      </w:r>
+    </w:p>
+    <w:p>
+      <w:pPr/>
+      <w:r>
+        <w:rPr>
+          <w:rFonts w:ascii="Times" w:hAnsi="Times" w:cs="Times"/>
+          <w:sz w:val="24"/>
+          <w:sz-cs w:val="24"/>
+          <w:spacing w:val="0"/>
+        </w:rPr>
+        <w:t xml:space="preserve">0.052</w:t>
+      </w:r>
+    </w:p>
+    <w:p>
+      <w:pPr>
+        <w:spacing w:after="240"/>
+      </w:pPr>
+      <w:r>
+        <w:rPr>
+          <w:rFonts w:ascii="Times" w:hAnsi="Times" w:cs="Times"/>
+          <w:sz w:val="24"/>
+          <w:sz-cs w:val="24"/>
+          <w:i/>
+          <w:spacing w:val="0"/>
+        </w:rPr>
+        <w:t xml:space="preserve">Note: Standard errors clustered by region. Both models include 17 region effects and 10 year effects.</w:t>
+      </w:r>
+      <w:r>
+        <w:rPr>
+          <w:rFonts w:ascii="Times" w:hAnsi="Times" w:cs="Times"/>
+          <w:sz w:val="24"/>
+          <w:sz-cs w:val="24"/>
+          <w:spacing w:val="0"/>
+        </w:rPr>
+        <w:t xml:space="preserve"/>
+      </w:r>
+    </w:p>
+    <w:p>
+      <w:pPr>
+        <w:spacing w:after="240"/>
+      </w:pPr>
+      <w:r>
+        <w:rPr>
+          <w:rFonts w:ascii="Times" w:hAnsi="Times" w:cs="Times"/>
+          <w:sz w:val="24"/>
+          <w:sz-cs w:val="24"/>
+          <w:spacing w:val="0"/>
+        </w:rPr>
+        <w:t xml:space="preserve">The reversal in sign between the unadjusted Pearson correlation (+0.887) and the fixed-effects estimate (−2.554) is substantively meaningful. It indicates that the positive cross-sectional association is driven by between-region differences — specifically, higher-development, more urbanized regions having simultaneously higher pollution and better-diagnosed asthma — rather than by within-region temporal responses to pollution changes. After absorbing these structural differences through region fixed effects, and removing shared national time trends through year fixed effects, year-to-year pollution increases within individual regions are associated with small decreases in measured asthma prevalence, a finding consistent with the known sluggishness of asthma prevalence as a "stock" outcome variable (see Discussion).</w:t>
+      </w:r>
+    </w:p>
+    <w:p>
+      <w:pPr>
+        <w:spacing w:after="280"/>
+      </w:pPr>
+      <w:r>
+        <w:rPr>
+          <w:rFonts w:ascii="Times" w:hAnsi="Times" w:cs="Times"/>
+          <w:sz w:val="28"/>
+          <w:sz-cs w:val="28"/>
+          <w:b/>
+          <w:spacing w:val="0"/>
+        </w:rPr>
+        <w:t xml:space="preserve">3.5 Robustness Check: First Differences</w:t>
+      </w:r>
+    </w:p>
+    <w:p>
+      <w:pPr>
+        <w:spacing w:after="240"/>
+      </w:pPr>
+      <w:r>
+        <w:rPr>
+          <w:rFonts w:ascii="Times" w:hAnsi="Times" w:cs="Times"/>
+          <w:sz w:val="24"/>
+          <w:sz-cs w:val="24"/>
+          <w:spacing w:val="0"/>
+        </w:rPr>
+        <w:t xml:space="preserve">As a robustness check, we estimated a first-differences specification, correlating year-to-year changes in PM2.5 with year-to-year changes in asthma prevalence within each region (n = 153 region-year pairs). This approach eliminates all time-invariant confounders without requiring parametric modeling. The first-differences correlation was positive and statistically significant (Pearson r = +0.199, p = 0.014), a directional reversal from the fixed-effects result but consistent with the hypothesis that contemporaneous annual pollution increases may weakly predict contemporaneous asthma increases at the margin. The small magnitude of this association (r = 0.199) is consistent with the low within-R² values observed in the fixed-effects models and with the overall stability of asthma prevalence rates across the study period (coefficient of variation: 4.9%).</w:t>
+      </w:r>
+    </w:p>
+    <w:p>
+      <w:pPr>
+        <w:spacing w:after="280"/>
+      </w:pPr>
+      <w:r>
+        <w:rPr>
+          <w:rFonts w:ascii="Times" w:hAnsi="Times" w:cs="Times"/>
+          <w:sz w:val="28"/>
+          <w:sz-cs w:val="28"/>
+          <w:b/>
+          <w:spacing w:val="0"/>
+        </w:rPr>
+        <w:t xml:space="preserve">3.6 Summary of Findings</w:t>
+      </w:r>
+    </w:p>
+    <w:p>
+      <w:pPr>
+        <w:spacing w:after="240"/>
+      </w:pPr>
+      <w:r>
+        <w:rPr>
+          <w:rFonts w:ascii="Times" w:hAnsi="Times" w:cs="Times"/>
+          <w:sz w:val="24"/>
+          <w:sz-cs w:val="24"/>
+          <w:spacing w:val="0"/>
+        </w:rPr>
+        <w:t xml:space="preserve">Four key findings emerge from this analysis:</w:t>
+      </w:r>
+    </w:p>
+    <w:p>
+      <w:pPr>
+        <w:ind w:left="720" w:first-line="-720"/>
+        <w:spacing w:after="240"/>
+      </w:pPr>
+      <w:r>
+        <w:rPr>
+          <w:rFonts w:ascii="Times" w:hAnsi="Times" w:cs="Times"/>
+          <w:sz w:val="24"/>
+          <w:sz-cs w:val="24"/>
+          <w:b/>
+        </w:rPr>
+        <w:t xml:space="preserve"/>
+        <w:tab/>
+        <w:t xml:space="preserve">1</w:t>
+        <w:tab/>
+        <w:t xml:space="preserve"/>
+      </w:r>
+      <w:r>
+        <w:rPr>
+          <w:rFonts w:ascii="Times" w:hAnsi="Times" w:cs="Times"/>
+          <w:sz w:val="24"/>
+          <w:sz-cs w:val="24"/>
+          <w:b/>
+          <w:spacing w:val="0"/>
+        </w:rPr>
+        <w:t xml:space="preserve">WHO threshold exceedances are common.</w:t>
+      </w:r>
+      <w:r>
+        <w:rPr>
+          <w:rFonts w:ascii="Times" w:hAnsi="Times" w:cs="Times"/>
+          <w:sz w:val="24"/>
+          <w:sz-cs w:val="24"/>
+          <w:spacing w:val="0"/>
+        </w:rPr>
+        <w:t xml:space="preserve"> One-third (34.1%) of all Philippine region-years exceeded the WHO annual PM2.5 guideline of 15 µg/m³ during 2013–2022, with NCR exceeding the threshold in every year of the study.</w:t>
+      </w:r>
+    </w:p>
+    <w:p>
+      <w:pPr>
+        <w:ind w:left="720" w:first-line="-720"/>
+        <w:spacing w:after="240"/>
+      </w:pPr>
+      <w:r>
+        <w:rPr>
+          <w:rFonts w:ascii="Times" w:hAnsi="Times" w:cs="Times"/>
+          <w:sz w:val="24"/>
+          <w:sz-cs w:val="24"/>
+          <w:b/>
+        </w:rPr>
+        <w:t xml:space="preserve"/>
+        <w:tab/>
+        <w:t xml:space="preserve">2</w:t>
+        <w:tab/>
+        <w:t xml:space="preserve"/>
+      </w:r>
+      <w:r>
+        <w:rPr>
+          <w:rFonts w:ascii="Times" w:hAnsi="Times" w:cs="Times"/>
+          <w:sz w:val="24"/>
+          <w:sz-cs w:val="24"/>
+          <w:b/>
+          <w:spacing w:val="0"/>
+        </w:rPr>
+        <w:t xml:space="preserve">Cross-regional differences are large and correlate with pollution.</w:t>
+      </w:r>
+      <w:r>
+        <w:rPr>
+          <w:rFonts w:ascii="Times" w:hAnsi="Times" w:cs="Times"/>
+          <w:sz w:val="24"/>
+          <w:sz-cs w:val="24"/>
+          <w:spacing w:val="0"/>
+        </w:rPr>
+        <w:t xml:space="preserve"> The unadjusted association between regional mean PM2.5 and pediatric asthma prevalence is strong (r = 0.887), driven primarily by NCR, which has both the highest pollution exposure and the highest asthma burden of any region.</w:t>
+      </w:r>
+    </w:p>
+    <w:p>
+      <w:pPr>
+        <w:ind w:left="720" w:first-line="-720"/>
+        <w:spacing w:after="240"/>
+      </w:pPr>
+      <w:r>
+        <w:rPr>
+          <w:rFonts w:ascii="Times" w:hAnsi="Times" w:cs="Times"/>
+          <w:sz w:val="24"/>
+          <w:sz-cs w:val="24"/>
+          <w:b/>
+        </w:rPr>
+        <w:t xml:space="preserve"/>
+        <w:tab/>
+        <w:t xml:space="preserve">3</w:t>
+        <w:tab/>
+        <w:t xml:space="preserve"/>
+      </w:r>
+      <w:r>
+        <w:rPr>
+          <w:rFonts w:ascii="Times" w:hAnsi="Times" w:cs="Times"/>
+          <w:sz w:val="24"/>
+          <w:sz-cs w:val="24"/>
+          <w:b/>
+          <w:spacing w:val="0"/>
+        </w:rPr>
+        <w:t xml:space="preserve">Within-region temporal associations are small and negative after adjustment.</w:t>
+      </w:r>
+      <w:r>
+        <w:rPr>
+          <w:rFonts w:ascii="Times" w:hAnsi="Times" w:cs="Times"/>
+          <w:sz w:val="24"/>
+          <w:sz-cs w:val="24"/>
+          <w:spacing w:val="0"/>
+        </w:rPr>
+        <w:t xml:space="preserve"> Two-way fixed-effects models find a statistically significant but small negative association between annual PM2.5 and asthma prevalence within regions over time (β = −2.554, p = 0.0024), a finding that likely reflects the insensitivity of prevalence as an outcome to short-term pollution fluctuations rather than a protective effect of pollution.</w:t>
+      </w:r>
+    </w:p>
+    <w:p>
+      <w:pPr>
+        <w:ind w:left="720" w:first-line="-720"/>
+        <w:spacing w:after="240"/>
+      </w:pPr>
+      <w:r>
+        <w:rPr>
+          <w:rFonts w:ascii="Times" w:hAnsi="Times" w:cs="Times"/>
+          <w:sz w:val="24"/>
+          <w:sz-cs w:val="24"/>
+          <w:b/>
+        </w:rPr>
+        <w:t xml:space="preserve"/>
+        <w:tab/>
+        <w:t xml:space="preserve">4</w:t>
+        <w:tab/>
+        <w:t xml:space="preserve"/>
+      </w:r>
+      <w:r>
+        <w:rPr>
+          <w:rFonts w:ascii="Times" w:hAnsi="Times" w:cs="Times"/>
+          <w:sz w:val="24"/>
+          <w:sz-cs w:val="24"/>
+          <w:b/>
+          <w:spacing w:val="0"/>
+        </w:rPr>
+        <w:t xml:space="preserve">Year-to-year pollution changes show weak positive associations with asthma changes.</w:t>
+      </w:r>
+      <w:r>
+        <w:rPr>
+          <w:rFonts w:ascii="Times" w:hAnsi="Times" w:cs="Times"/>
+          <w:sz w:val="24"/>
+          <w:sz-cs w:val="24"/>
+          <w:spacing w:val="0"/>
+        </w:rPr>
+        <w:t xml:space="preserve"> First-differences analysis yields a small positive correlation (r = +0.199, p = 0.014), directionally consistent with expected biological effects but small in magnitude, consistent with the hypothesis that annual PM2.5 changes are too modest within individual Philippine regions over this period to produce detectable changes in a slowly-moving prevalence measure.</w:t>
+      </w:r>
+    </w:p>
+    <w:p>
+      <w:pPr/>
+      <w:r>
+        <w:rPr>
+          <w:rFonts w:ascii="Times" w:hAnsi="Times" w:cs="Times"/>
+          <w:sz w:val="24"/>
+          <w:sz-cs w:val="24"/>
+          <w:spacing w:val="0"/>
+          <w:color w:val="6D6D6D"/>
+        </w:rPr>
+        <w:t xml:space="preserve"/>
+      </w:r>
+    </w:p>
+    <w:p>
+      <w:pPr>
+        <w:spacing w:after="240"/>
+      </w:pPr>
+      <w:r>
+        <w:rPr>
+          <w:rFonts w:ascii="Times" w:hAnsi="Times" w:cs="Times"/>
+          <w:sz w:val="24"/>
+          <w:sz-cs w:val="24"/>
+          <w:i/>
+          <w:spacing w:val="0"/>
+        </w:rPr>
+        <w:t xml:space="preserve">Figures referenced: Figure 1 (scatter plot, PM2.5 vs asthma prevalence, n=170); Figure 2 (national annual trend lines); Figure 3 (regional bar chart with WHO threshold); Figure 4 (heatmap of asthma prevalence by region and year). All figures in outputs/figures/.</w:t>
+      </w:r>
+      <w:r>
+        <w:rPr>
+          <w:rFonts w:ascii="Times" w:hAnsi="Times" w:cs="Times"/>
+          <w:sz w:val="24"/>
+          <w:sz-cs w:val="24"/>
+          <w:spacing w:val="0"/>
+        </w:rPr>
+        <w:t xml:space="preserve"/>
+      </w:r>
+    </w:p>
+    <w:p>
+      <w:pPr>
         <w:jc w:val="both"/>
       </w:pPr>
       <w:r>
@@ -262,89 +2227,7 @@
           <w:sz w:val="24"/>
           <w:sz-cs w:val="24"/>
         </w:rPr>
-        <w:t xml:space="preserve">Across the study period (2013–2022, n = 10 annual observations), modeled PM2.5 exposure in the Philippines rose steadily, with the summary exposure value (SEV) index increasing from 16.6 in 2013 to 22.8 in 2022. Over the same decade, pediatric asthma prevalence (ages 5–14) remained nearly constant, ranging only from approximately 7,448 to 7,598 cases per 100,000 — a total variation of under 2% (Figure 1).</w:t>
-      </w:r>
-    </w:p>
-    <w:p>
-      <w:pPr>
-        <w:jc w:val="center"/>
-        <w:spacing w:before="160" w:after="40"/>
-      </w:pPr>
-      <w:r>
-        <w:rPr>
-          <w:rFonts w:ascii="Times" w:hAnsi="Times" w:cs="Times"/>
-          <w:sz w:val="24"/>
-          <w:sz-cs w:val="24"/>
-        </w:rPr>
         <w:t xml:space="preserve"/>
-      </w:r>
-    </w:p>
-    <w:p>
-      <w:pPr>
-        <w:spacing w:before="40" w:after="200"/>
-      </w:pPr>
-      <w:r>
-        <w:rPr>
-          <w:rFonts w:ascii="Times" w:hAnsi="Times" w:cs="Times"/>
-          <w:sz w:val="20"/>
-          <w:sz-cs w:val="20"/>
-          <w:i/>
-        </w:rPr>
-        <w:t xml:space="preserve">Figure 1. Annual modeled PM2.5 exposure (SEV index, 0–100) and pediatric asthma prevalence (ages 5–14, per 100,000), Philippines, 2013–2022.</w:t>
-      </w:r>
-    </w:p>
-    <w:p>
-      <w:pPr>
-        <w:jc w:val="both"/>
-      </w:pPr>
-      <w:r>
-        <w:rPr>
-          <w:rFonts w:ascii="Times" w:hAnsi="Times" w:cs="Times"/>
-          <w:sz w:val="24"/>
-          <w:sz-cs w:val="24"/>
-        </w:rPr>
-        <w:t xml:space="preserve">At the level of annual values, PM2.5 exposure and asthma prevalence showed a weak-to-moderate positive correlation (Pearson r = 0.47, p = 0.17; Spearman ρ = 0.39, p = 0.26). This association did not reach statistical significance, and a permutation test produced consistent results (p ≈ 0.16). The positive direction is visible in the scatter of annual values (Figure 2), but the points deviate substantially from the fitted line.</w:t>
-      </w:r>
-    </w:p>
-    <w:p>
-      <w:pPr>
-        <w:jc w:val="center"/>
-        <w:spacing w:before="160" w:after="40"/>
-      </w:pPr>
-      <w:r>
-        <w:rPr>
-          <w:rFonts w:ascii="Times" w:hAnsi="Times" w:cs="Times"/>
-          <w:sz w:val="24"/>
-          <w:sz-cs w:val="24"/>
-        </w:rPr>
-        <w:t xml:space="preserve"/>
-      </w:r>
-    </w:p>
-    <w:p>
-      <w:pPr>
-        <w:spacing w:before="40" w:after="200"/>
-      </w:pPr>
-      <w:r>
-        <w:rPr>
-          <w:rFonts w:ascii="Times" w:hAnsi="Times" w:cs="Times"/>
-          <w:sz w:val="20"/>
-          <w:sz-cs w:val="20"/>
-          <w:i/>
-        </w:rPr>
-        <w:t xml:space="preserve">Figure 2. Annual pediatric asthma prevalence versus modeled PM2.5 exposure (SEV index), 2013–2022, with fitted regression line; points labeled by year.</w:t>
-      </w:r>
-    </w:p>
-    <w:p>
-      <w:pPr>
-        <w:jc w:val="both"/>
-      </w:pPr>
-      <w:r>
-        <w:rPr>
-          <w:rFonts w:ascii="Times" w:hAnsi="Times" w:cs="Times"/>
-          <w:sz w:val="24"/>
-          <w:sz-cs w:val="24"/>
-        </w:rPr>
-        <w:t xml:space="preserve">Because both series exhibit a strong shared upward or stable trend over time, a level correlation can arise from coincident temporal trends rather than from a direct relationship between the two variables. To address this, the analysis was repeated on year-over-year changes (first differences, n = 9), which removes the common time trend. After detrending, the association disappeared and reversed in sign (Pearson r = −0.10, p = 0.80; Spearman ρ = −0.13, p = 0.73). The collapse of the correlation once the shared trend is removed indicates that the modest positive correlation in the raw levels is attributable to coincident temporal trends rather than to a year-to-year relationship between PM2.5 exposure and pediatric asthma prevalence.</w:t>
       </w:r>
     </w:p>
     <w:p>

</xml_diff>